<commit_message>
iniciando la creacion de las vistas
</commit_message>
<xml_diff>
--- a/documentos/estructura de datos.docx
+++ b/documentos/estructura de datos.docx
@@ -811,12 +811,14 @@
                 <w:rFonts w:ascii="Arial" w:hAnsi="Arial" w:cs="Arial"/>
               </w:rPr>
             </w:pPr>
+            <w:proofErr w:type="spellStart"/>
             <w:r>
               <w:rPr>
                 <w:rFonts w:ascii="Arial" w:hAnsi="Arial" w:cs="Arial"/>
               </w:rPr>
               <w:t>password</w:t>
             </w:r>
+            <w:proofErr w:type="spellEnd"/>
           </w:p>
         </w:tc>
       </w:tr>
@@ -2679,6 +2681,7 @@
       <w:r>
         <w:rPr>
           <w:rFonts w:ascii="Arial" w:hAnsi="Arial" w:cs="Arial"/>
+          <w:noProof/>
         </w:rPr>
         <w:drawing>
           <wp:inline distT="0" distB="0" distL="0" distR="0" wp14:anchorId="6FE123E7" wp14:editId="5C180EF0">
@@ -2759,6 +2762,7 @@
       <w:r>
         <w:rPr>
           <w:rFonts w:ascii="Arial" w:hAnsi="Arial" w:cs="Arial"/>
+          <w:noProof/>
         </w:rPr>
         <w:drawing>
           <wp:inline distT="0" distB="0" distL="0" distR="0" wp14:anchorId="43AF23B3" wp14:editId="6C0A0FBB">
@@ -2833,6 +2837,7 @@
       <w:r>
         <w:rPr>
           <w:rFonts w:ascii="Arial" w:hAnsi="Arial" w:cs="Arial"/>
+          <w:noProof/>
         </w:rPr>
         <w:drawing>
           <wp:inline distT="0" distB="0" distL="0" distR="0" wp14:anchorId="7191D83F" wp14:editId="6C75D89D">
@@ -2913,6 +2918,7 @@
       <w:r>
         <w:rPr>
           <w:rFonts w:ascii="Arial" w:hAnsi="Arial" w:cs="Arial"/>
+          <w:noProof/>
         </w:rPr>
         <w:drawing>
           <wp:inline distT="0" distB="0" distL="0" distR="0" wp14:anchorId="2C92D0FB" wp14:editId="05E590C2">
@@ -2994,6 +3000,7 @@
       <w:r>
         <w:rPr>
           <w:rFonts w:ascii="Arial" w:hAnsi="Arial" w:cs="Arial"/>
+          <w:noProof/>
         </w:rPr>
         <w:drawing>
           <wp:inline distT="0" distB="0" distL="0" distR="0" wp14:anchorId="3531340A" wp14:editId="1869EDFD">
@@ -3048,43 +3055,228 @@
       <w:pPr>
         <w:rPr>
           <w:rFonts w:ascii="Arial" w:hAnsi="Arial" w:cs="Arial"/>
-        </w:rPr>
-      </w:pPr>
-    </w:p>
-    <w:p>
-      <w:pPr>
-        <w:rPr>
-          <w:rFonts w:ascii="Arial" w:hAnsi="Arial" w:cs="Arial"/>
-        </w:rPr>
-      </w:pPr>
-    </w:p>
-    <w:p>
-      <w:pPr>
-        <w:rPr>
-          <w:rFonts w:ascii="Arial" w:hAnsi="Arial" w:cs="Arial"/>
-        </w:rPr>
-      </w:pPr>
-    </w:p>
-    <w:p>
-      <w:pPr>
-        <w:rPr>
-          <w:rFonts w:ascii="Arial" w:hAnsi="Arial" w:cs="Arial"/>
-        </w:rPr>
-      </w:pPr>
-    </w:p>
-    <w:p>
-      <w:pPr>
-        <w:rPr>
-          <w:rFonts w:ascii="Arial" w:hAnsi="Arial" w:cs="Arial"/>
-        </w:rPr>
-      </w:pPr>
-    </w:p>
-    <w:p>
-      <w:pPr>
-        <w:rPr>
-          <w:rFonts w:ascii="Arial" w:hAnsi="Arial" w:cs="Arial"/>
-        </w:rPr>
-      </w:pPr>
+          <w:b/>
+          <w:bCs/>
+          <w:sz w:val="28"/>
+          <w:szCs w:val="28"/>
+        </w:rPr>
+      </w:pPr>
+      <w:r>
+        <w:rPr>
+          <w:rFonts w:ascii="Arial" w:hAnsi="Arial" w:cs="Arial"/>
+          <w:b/>
+          <w:bCs/>
+          <w:sz w:val="28"/>
+          <w:szCs w:val="28"/>
+        </w:rPr>
+        <w:t>Ver control de asistencia</w:t>
+      </w:r>
+    </w:p>
+    <w:p>
+      <w:pPr>
+        <w:rPr>
+          <w:rFonts w:ascii="Arial" w:hAnsi="Arial" w:cs="Arial"/>
+        </w:rPr>
+      </w:pPr>
+      <w:r>
+        <w:rPr>
+          <w:rFonts w:ascii="Arial" w:hAnsi="Arial" w:cs="Arial"/>
+        </w:rPr>
+        <w:drawing>
+          <wp:inline distT="0" distB="0" distL="0" distR="0" wp14:anchorId="648727D1" wp14:editId="46CE2548">
+            <wp:extent cx="5420783" cy="3921750"/>
+            <wp:effectExtent l="19050" t="19050" r="27940" b="22225"/>
+            <wp:docPr id="465802581" name="Imagen 1"/>
+            <wp:cNvGraphicFramePr>
+              <a:graphicFrameLocks xmlns:a="http://schemas.openxmlformats.org/drawingml/2006/main" noChangeAspect="1"/>
+            </wp:cNvGraphicFramePr>
+            <a:graphic xmlns:a="http://schemas.openxmlformats.org/drawingml/2006/main">
+              <a:graphicData uri="http://schemas.openxmlformats.org/drawingml/2006/picture">
+                <pic:pic xmlns:pic="http://schemas.openxmlformats.org/drawingml/2006/picture">
+                  <pic:nvPicPr>
+                    <pic:cNvPr id="465802581" name=""/>
+                    <pic:cNvPicPr/>
+                  </pic:nvPicPr>
+                  <pic:blipFill>
+                    <a:blip r:embed="rId15"/>
+                    <a:stretch>
+                      <a:fillRect/>
+                    </a:stretch>
+                  </pic:blipFill>
+                  <pic:spPr>
+                    <a:xfrm>
+                      <a:off x="0" y="0"/>
+                      <a:ext cx="5424780" cy="3924641"/>
+                    </a:xfrm>
+                    <a:prstGeom prst="rect">
+                      <a:avLst/>
+                    </a:prstGeom>
+                    <a:ln>
+                      <a:solidFill>
+                        <a:schemeClr val="tx1"/>
+                      </a:solidFill>
+                    </a:ln>
+                  </pic:spPr>
+                </pic:pic>
+              </a:graphicData>
+            </a:graphic>
+          </wp:inline>
+        </w:drawing>
+      </w:r>
+    </w:p>
+    <w:p>
+      <w:pPr>
+        <w:rPr>
+          <w:rFonts w:ascii="Arial" w:hAnsi="Arial" w:cs="Arial"/>
+          <w:b/>
+          <w:bCs/>
+          <w:sz w:val="28"/>
+          <w:szCs w:val="28"/>
+        </w:rPr>
+      </w:pPr>
+      <w:r>
+        <w:rPr>
+          <w:rFonts w:ascii="Arial" w:hAnsi="Arial" w:cs="Arial"/>
+          <w:b/>
+          <w:bCs/>
+          <w:sz w:val="28"/>
+          <w:szCs w:val="28"/>
+        </w:rPr>
+        <w:lastRenderedPageBreak/>
+        <w:t>Registrar asistencia</w:t>
+      </w:r>
+    </w:p>
+    <w:p>
+      <w:pPr>
+        <w:rPr>
+          <w:rFonts w:ascii="Arial" w:hAnsi="Arial" w:cs="Arial"/>
+        </w:rPr>
+      </w:pPr>
+      <w:r>
+        <w:rPr>
+          <w:rFonts w:ascii="Arial" w:hAnsi="Arial" w:cs="Arial"/>
+        </w:rPr>
+        <w:drawing>
+          <wp:inline distT="0" distB="0" distL="0" distR="0" wp14:anchorId="559044CD" wp14:editId="168BC20F">
+            <wp:extent cx="5731510" cy="2489835"/>
+            <wp:effectExtent l="19050" t="19050" r="21590" b="24765"/>
+            <wp:docPr id="1768915038" name="Imagen 1"/>
+            <wp:cNvGraphicFramePr>
+              <a:graphicFrameLocks xmlns:a="http://schemas.openxmlformats.org/drawingml/2006/main" noChangeAspect="1"/>
+            </wp:cNvGraphicFramePr>
+            <a:graphic xmlns:a="http://schemas.openxmlformats.org/drawingml/2006/main">
+              <a:graphicData uri="http://schemas.openxmlformats.org/drawingml/2006/picture">
+                <pic:pic xmlns:pic="http://schemas.openxmlformats.org/drawingml/2006/picture">
+                  <pic:nvPicPr>
+                    <pic:cNvPr id="1768915038" name=""/>
+                    <pic:cNvPicPr/>
+                  </pic:nvPicPr>
+                  <pic:blipFill>
+                    <a:blip r:embed="rId16"/>
+                    <a:stretch>
+                      <a:fillRect/>
+                    </a:stretch>
+                  </pic:blipFill>
+                  <pic:spPr>
+                    <a:xfrm>
+                      <a:off x="0" y="0"/>
+                      <a:ext cx="5731510" cy="2489835"/>
+                    </a:xfrm>
+                    <a:prstGeom prst="rect">
+                      <a:avLst/>
+                    </a:prstGeom>
+                    <a:ln>
+                      <a:solidFill>
+                        <a:schemeClr val="tx1"/>
+                      </a:solidFill>
+                    </a:ln>
+                  </pic:spPr>
+                </pic:pic>
+              </a:graphicData>
+            </a:graphic>
+          </wp:inline>
+        </w:drawing>
+      </w:r>
+    </w:p>
+    <w:p>
+      <w:pPr>
+        <w:rPr>
+          <w:rFonts w:ascii="Arial" w:hAnsi="Arial" w:cs="Arial"/>
+        </w:rPr>
+      </w:pPr>
+    </w:p>
+    <w:p>
+      <w:pPr>
+        <w:rPr>
+          <w:rFonts w:ascii="Arial" w:hAnsi="Arial" w:cs="Arial"/>
+          <w:b/>
+          <w:bCs/>
+          <w:sz w:val="28"/>
+          <w:szCs w:val="28"/>
+        </w:rPr>
+      </w:pPr>
+      <w:r>
+        <w:rPr>
+          <w:rFonts w:ascii="Arial" w:hAnsi="Arial" w:cs="Arial"/>
+          <w:b/>
+          <w:bCs/>
+          <w:sz w:val="28"/>
+          <w:szCs w:val="28"/>
+        </w:rPr>
+        <w:t>Importar asistencia</w:t>
+      </w:r>
+    </w:p>
+    <w:p>
+      <w:pPr>
+        <w:rPr>
+          <w:rFonts w:ascii="Arial" w:hAnsi="Arial" w:cs="Arial"/>
+        </w:rPr>
+      </w:pPr>
+      <w:r>
+        <w:rPr>
+          <w:rFonts w:ascii="Arial" w:hAnsi="Arial" w:cs="Arial"/>
+        </w:rPr>
+        <w:drawing>
+          <wp:inline distT="0" distB="0" distL="0" distR="0" wp14:anchorId="23D9995B" wp14:editId="784139B2">
+            <wp:extent cx="5731510" cy="2466975"/>
+            <wp:effectExtent l="19050" t="19050" r="21590" b="28575"/>
+            <wp:docPr id="901053875" name="Imagen 1"/>
+            <wp:cNvGraphicFramePr>
+              <a:graphicFrameLocks xmlns:a="http://schemas.openxmlformats.org/drawingml/2006/main" noChangeAspect="1"/>
+            </wp:cNvGraphicFramePr>
+            <a:graphic xmlns:a="http://schemas.openxmlformats.org/drawingml/2006/main">
+              <a:graphicData uri="http://schemas.openxmlformats.org/drawingml/2006/picture">
+                <pic:pic xmlns:pic="http://schemas.openxmlformats.org/drawingml/2006/picture">
+                  <pic:nvPicPr>
+                    <pic:cNvPr id="901053875" name=""/>
+                    <pic:cNvPicPr/>
+                  </pic:nvPicPr>
+                  <pic:blipFill>
+                    <a:blip r:embed="rId17"/>
+                    <a:stretch>
+                      <a:fillRect/>
+                    </a:stretch>
+                  </pic:blipFill>
+                  <pic:spPr>
+                    <a:xfrm>
+                      <a:off x="0" y="0"/>
+                      <a:ext cx="5731510" cy="2466975"/>
+                    </a:xfrm>
+                    <a:prstGeom prst="rect">
+                      <a:avLst/>
+                    </a:prstGeom>
+                    <a:ln>
+                      <a:solidFill>
+                        <a:schemeClr val="tx1"/>
+                      </a:solidFill>
+                    </a:ln>
+                  </pic:spPr>
+                </pic:pic>
+              </a:graphicData>
+            </a:graphic>
+          </wp:inline>
+        </w:drawing>
+      </w:r>
     </w:p>
     <w:p>
       <w:pPr>

</xml_diff>